<commit_message>
Add security audit report, editor settings and update docs
</commit_message>
<xml_diff>
--- a/docs/CareNest-HIMS-Local-Setup-Guide.docx
+++ b/docs/CareNest-HIMS-Local-Setup-Guide.docx
@@ -1556,13 +1556,12 @@
           <w:p>
             <w:r>
               <w:rPr>
-                <w:rFonts w:ascii="Consolas" w:cs="Consolas" w:eastAsia="Consolas" w:hAnsi="Consolas"/>
-                <w:b w:val="false"/>
-                <w:bCs w:val="false"/>
-                <w:sz w:val="20"/>
-                <w:szCs w:val="20"/>
-              </w:rPr>
-              <w:t xml:space="preserve">a-long-random-sentence-2026</w:t>
+                <w:b w:val="false"/>
+                <w:bCs w:val="false"/>
+                <w:sz w:val="20"/>
+                <w:szCs w:val="20"/>
+              </w:rPr>
+              <w:t xml:space="preserve">(filled by npm run secret)</w:t>
             </w:r>
           </w:p>
         </w:tc>
@@ -1584,7 +1583,7 @@
                 <w:sz w:val="20"/>
                 <w:szCs w:val="20"/>
               </w:rPr>
-              <w:t xml:space="preserve">Secret used to sign logins. Change to any long random text.</w:t>
+              <w:t xml:space="preserve">Secret that signs logins. Leave it empty here — the next step fills it.</w:t>
             </w:r>
           </w:p>
         </w:tc>
@@ -1685,7 +1684,7 @@
                 <w:sz w:val="20"/>
                 <w:szCs w:val="20"/>
               </w:rPr>
-              <w:t xml:space="preserve">DB_HOST</w:t>
+              <w:t xml:space="preserve">ALLOW_SELF_SIGNUP</w:t>
             </w:r>
           </w:p>
         </w:tc>
@@ -1708,7 +1707,7 @@
                 <w:sz w:val="20"/>
                 <w:szCs w:val="20"/>
               </w:rPr>
-              <w:t xml:space="preserve">127.0.0.1</w:t>
+              <w:t xml:space="preserve">false</w:t>
             </w:r>
           </w:p>
         </w:tc>
@@ -1730,7 +1729,7 @@
                 <w:sz w:val="20"/>
                 <w:szCs w:val="20"/>
               </w:rPr>
-              <w:t xml:space="preserve">Where MySQL runs (your own laptop).</w:t>
+              <w:t xml:space="preserve">Keep false: doctor accounts are created by your team in the admin console.</w:t>
             </w:r>
           </w:p>
         </w:tc>
@@ -1758,7 +1757,7 @@
                 <w:sz w:val="20"/>
                 <w:szCs w:val="20"/>
               </w:rPr>
-              <w:t xml:space="preserve">DB_PORT</w:t>
+              <w:t xml:space="preserve">DB_HOST</w:t>
             </w:r>
           </w:p>
         </w:tc>
@@ -1781,7 +1780,7 @@
                 <w:sz w:val="20"/>
                 <w:szCs w:val="20"/>
               </w:rPr>
-              <w:t xml:space="preserve">3306</w:t>
+              <w:t xml:space="preserve">127.0.0.1</w:t>
             </w:r>
           </w:p>
         </w:tc>
@@ -1803,7 +1802,7 @@
                 <w:sz w:val="20"/>
                 <w:szCs w:val="20"/>
               </w:rPr>
-              <w:t xml:space="preserve">MySQL port.</w:t>
+              <w:t xml:space="preserve">Where MySQL runs (your own laptop).</w:t>
             </w:r>
           </w:p>
         </w:tc>
@@ -1831,7 +1830,7 @@
                 <w:sz w:val="20"/>
                 <w:szCs w:val="20"/>
               </w:rPr>
-              <w:t xml:space="preserve">DB_USER</w:t>
+              <w:t xml:space="preserve">DB_PORT</w:t>
             </w:r>
           </w:p>
         </w:tc>
@@ -1854,7 +1853,7 @@
                 <w:sz w:val="20"/>
                 <w:szCs w:val="20"/>
               </w:rPr>
-              <w:t xml:space="preserve">root</w:t>
+              <w:t xml:space="preserve">3306</w:t>
             </w:r>
           </w:p>
         </w:tc>
@@ -1876,7 +1875,7 @@
                 <w:sz w:val="20"/>
                 <w:szCs w:val="20"/>
               </w:rPr>
-              <w:t xml:space="preserve">MySQL user name.</w:t>
+              <w:t xml:space="preserve">MySQL port.</w:t>
             </w:r>
           </w:p>
         </w:tc>
@@ -1904,7 +1903,7 @@
                 <w:sz w:val="20"/>
                 <w:szCs w:val="20"/>
               </w:rPr>
-              <w:t xml:space="preserve">DB_PASSWORD</w:t>
+              <w:t xml:space="preserve">DB_USER</w:t>
             </w:r>
           </w:p>
         </w:tc>
@@ -1921,12 +1920,13 @@
           <w:p>
             <w:r>
               <w:rPr>
-                <w:b w:val="false"/>
-                <w:bCs w:val="false"/>
-                <w:sz w:val="20"/>
-                <w:szCs w:val="20"/>
-              </w:rPr>
-              <w:t xml:space="preserve">(your password)</w:t>
+                <w:rFonts w:ascii="Consolas" w:cs="Consolas" w:eastAsia="Consolas" w:hAnsi="Consolas"/>
+                <w:b w:val="false"/>
+                <w:bCs w:val="false"/>
+                <w:sz w:val="20"/>
+                <w:szCs w:val="20"/>
+              </w:rPr>
+              <w:t xml:space="preserve">root</w:t>
             </w:r>
           </w:p>
         </w:tc>
@@ -1948,7 +1948,7 @@
                 <w:sz w:val="20"/>
                 <w:szCs w:val="20"/>
               </w:rPr>
-              <w:t xml:space="preserve">The root password you set while installing MySQL.</w:t>
+              <w:t xml:space="preserve">MySQL user name.</w:t>
             </w:r>
           </w:p>
         </w:tc>
@@ -1976,6 +1976,78 @@
                 <w:sz w:val="20"/>
                 <w:szCs w:val="20"/>
               </w:rPr>
+              <w:t xml:space="preserve">DB_PASSWORD</w:t>
+            </w:r>
+          </w:p>
+        </w:tc>
+        <w:tc>
+          <w:tcPr>
+            <w:tcW w:type="dxa" w:w="3100"/>
+            <w:tcMar>
+              <w:top w:type="dxa" w:w="80"/>
+              <w:left w:type="dxa" w:w="120"/>
+              <w:bottom w:type="dxa" w:w="80"/>
+              <w:right w:type="dxa" w:w="120"/>
+            </w:tcMar>
+          </w:tcPr>
+          <w:p>
+            <w:r>
+              <w:rPr>
+                <w:b w:val="false"/>
+                <w:bCs w:val="false"/>
+                <w:sz w:val="20"/>
+                <w:szCs w:val="20"/>
+              </w:rPr>
+              <w:t xml:space="preserve">(your password)</w:t>
+            </w:r>
+          </w:p>
+        </w:tc>
+        <w:tc>
+          <w:tcPr>
+            <w:tcW w:type="dxa" w:w="3926"/>
+            <w:tcMar>
+              <w:top w:type="dxa" w:w="80"/>
+              <w:left w:type="dxa" w:w="120"/>
+              <w:bottom w:type="dxa" w:w="80"/>
+              <w:right w:type="dxa" w:w="120"/>
+            </w:tcMar>
+          </w:tcPr>
+          <w:p>
+            <w:r>
+              <w:rPr>
+                <w:b w:val="false"/>
+                <w:bCs w:val="false"/>
+                <w:sz w:val="20"/>
+                <w:szCs w:val="20"/>
+              </w:rPr>
+              <w:t xml:space="preserve">The root password you set while installing MySQL.</w:t>
+            </w:r>
+          </w:p>
+        </w:tc>
+      </w:tr>
+      <w:tr>
+        <w:trPr>
+          <w:tblHeader w:val="false"/>
+        </w:trPr>
+        <w:tc>
+          <w:tcPr>
+            <w:tcW w:type="dxa" w:w="2000"/>
+            <w:tcMar>
+              <w:top w:type="dxa" w:w="80"/>
+              <w:left w:type="dxa" w:w="120"/>
+              <w:bottom w:type="dxa" w:w="80"/>
+              <w:right w:type="dxa" w:w="120"/>
+            </w:tcMar>
+          </w:tcPr>
+          <w:p>
+            <w:r>
+              <w:rPr>
+                <w:rFonts w:ascii="Consolas" w:cs="Consolas" w:eastAsia="Consolas" w:hAnsi="Consolas"/>
+                <w:b w:val="false"/>
+                <w:bCs w:val="false"/>
+                <w:sz w:val="20"/>
+                <w:szCs w:val="20"/>
+              </w:rPr>
               <w:t xml:space="preserve">DB_NAME</w:t>
             </w:r>
           </w:p>
@@ -2035,6 +2107,84 @@
         <w:t xml:space="preserve"/>
       </w:r>
     </w:p>
+    <w:p>
+      <w:pPr>
+        <w:pStyle w:val="ListParagraph"/>
+        <w:numPr>
+          <w:ilvl w:val="0"/>
+          <w:numId w:val="4"/>
+        </w:numPr>
+        <w:spacing w:after="80"/>
+      </w:pPr>
+      <w:r>
+        <w:t xml:space="preserve">Create a strong random secret for signing logins (one time):</w:t>
+      </w:r>
+    </w:p>
+    <w:tbl>
+      <w:tblPr>
+        <w:tblW w:type="dxa" w:w="9026"/>
+        <w:tblBorders>
+          <w:top w:val="single" w:color="auto" w:sz="4"/>
+          <w:left w:val="single" w:color="auto" w:sz="4"/>
+          <w:bottom w:val="single" w:color="auto" w:sz="4"/>
+          <w:right w:val="single" w:color="auto" w:sz="4"/>
+          <w:insideH w:val="single" w:color="auto" w:sz="4"/>
+          <w:insideV w:val="single" w:color="auto" w:sz="4"/>
+        </w:tblBorders>
+      </w:tblPr>
+      <w:tblGrid>
+        <w:gridCol w:w="9026"/>
+      </w:tblGrid>
+      <w:tr>
+        <w:tc>
+          <w:tcPr>
+            <w:tcW w:type="dxa" w:w="9026"/>
+            <w:tcBorders>
+              <w:top w:val="none"/>
+              <w:left w:val="single" w:color="2E8B6E" w:sz="18"/>
+              <w:bottom w:val="none"/>
+              <w:right w:val="none"/>
+            </w:tcBorders>
+            <w:shd w:fill="F3F5F8" w:color="auto" w:val="clear"/>
+            <w:tcMar>
+              <w:top w:type="dxa" w:w="120"/>
+              <w:left w:type="dxa" w:w="200"/>
+              <w:bottom w:type="dxa" w:w="120"/>
+              <w:right w:type="dxa" w:w="200"/>
+            </w:tcMar>
+          </w:tcPr>
+          <w:p>
+            <w:pPr>
+              <w:spacing w:after="40"/>
+            </w:pPr>
+            <w:r>
+              <w:rPr>
+                <w:rFonts w:ascii="Consolas" w:cs="Consolas" w:eastAsia="Consolas" w:hAnsi="Consolas"/>
+                <w:color w:val="1F4E79"/>
+                <w:sz w:val="20"/>
+                <w:szCs w:val="20"/>
+              </w:rPr>
+              <w:t xml:space="preserve">npm run secret</w:t>
+            </w:r>
+          </w:p>
+          <w:p>
+            <w:pPr>
+              <w:spacing w:before="60"/>
+            </w:pPr>
+            <w:r>
+              <w:rPr>
+                <w:i/>
+                <w:iCs/>
+                <w:color w:val="666666"/>
+                <w:sz w:val="18"/>
+                <w:szCs w:val="18"/>
+              </w:rPr>
+              <w:t xml:space="preserve">Writes a 96-character random JWT_SECRET into server/.env. Without it, everyone is signed out whenever the server restarts.</w:t>
+            </w:r>
+          </w:p>
+        </w:tc>
+      </w:tr>
+    </w:tbl>
     <w:p>
       <w:pPr>
         <w:pStyle w:val="ListParagraph"/>
@@ -2344,7 +2494,7 @@
                 <w:sz w:val="20"/>
                 <w:szCs w:val="20"/>
               </w:rPr>
-              <w:t xml:space="preserve">Doctor (owns both clinics)</w:t>
+              <w:t xml:space="preserve">Platform admin (your team)</w:t>
             </w:r>
           </w:p>
         </w:tc>
@@ -2367,7 +2517,7 @@
                 <w:sz w:val="20"/>
                 <w:szCs w:val="20"/>
               </w:rPr>
-              <w:t xml:space="preserve">doctor@demo.com</w:t>
+              <w:t xml:space="preserve">admin@carenest.app</w:t>
             </w:r>
           </w:p>
         </w:tc>
@@ -2390,7 +2540,7 @@
                 <w:sz w:val="20"/>
                 <w:szCs w:val="20"/>
               </w:rPr>
-              <w:t xml:space="preserve">demo123</w:t>
+              <w:t xml:space="preserve">Admin@123</w:t>
             </w:r>
           </w:p>
         </w:tc>
@@ -2417,7 +2567,7 @@
                 <w:sz w:val="20"/>
                 <w:szCs w:val="20"/>
               </w:rPr>
-              <w:t xml:space="preserve">Nurse — Sunrise Family Clinic</w:t>
+              <w:t xml:space="preserve">Doctor (owns both clinics)</w:t>
             </w:r>
           </w:p>
         </w:tc>
@@ -2440,7 +2590,7 @@
                 <w:sz w:val="20"/>
                 <w:szCs w:val="20"/>
               </w:rPr>
-              <w:t xml:space="preserve">nurse@demo.com</w:t>
+              <w:t xml:space="preserve">doctor@demo.com</w:t>
             </w:r>
           </w:p>
         </w:tc>
@@ -2463,7 +2613,7 @@
                 <w:sz w:val="20"/>
                 <w:szCs w:val="20"/>
               </w:rPr>
-              <w:t xml:space="preserve">demo123</w:t>
+              <w:t xml:space="preserve">Demo@123</w:t>
             </w:r>
           </w:p>
         </w:tc>
@@ -2490,6 +2640,79 @@
                 <w:sz w:val="20"/>
                 <w:szCs w:val="20"/>
               </w:rPr>
+              <w:t xml:space="preserve">Nurse — Sunrise Family Clinic</w:t>
+            </w:r>
+          </w:p>
+        </w:tc>
+        <w:tc>
+          <w:tcPr>
+            <w:tcW w:type="dxa" w:w="3000"/>
+            <w:tcMar>
+              <w:top w:type="dxa" w:w="80"/>
+              <w:left w:type="dxa" w:w="120"/>
+              <w:bottom w:type="dxa" w:w="80"/>
+              <w:right w:type="dxa" w:w="120"/>
+            </w:tcMar>
+          </w:tcPr>
+          <w:p>
+            <w:r>
+              <w:rPr>
+                <w:rFonts w:ascii="Consolas" w:cs="Consolas" w:eastAsia="Consolas" w:hAnsi="Consolas"/>
+                <w:b w:val="false"/>
+                <w:bCs w:val="false"/>
+                <w:sz w:val="20"/>
+                <w:szCs w:val="20"/>
+              </w:rPr>
+              <w:t xml:space="preserve">nurse@demo.com</w:t>
+            </w:r>
+          </w:p>
+        </w:tc>
+        <w:tc>
+          <w:tcPr>
+            <w:tcW w:type="dxa" w:w="2426"/>
+            <w:tcMar>
+              <w:top w:type="dxa" w:w="80"/>
+              <w:left w:type="dxa" w:w="120"/>
+              <w:bottom w:type="dxa" w:w="80"/>
+              <w:right w:type="dxa" w:w="120"/>
+            </w:tcMar>
+          </w:tcPr>
+          <w:p>
+            <w:r>
+              <w:rPr>
+                <w:rFonts w:ascii="Consolas" w:cs="Consolas" w:eastAsia="Consolas" w:hAnsi="Consolas"/>
+                <w:b w:val="false"/>
+                <w:bCs w:val="false"/>
+                <w:sz w:val="20"/>
+                <w:szCs w:val="20"/>
+              </w:rPr>
+              <w:t xml:space="preserve">Demo@123</w:t>
+            </w:r>
+          </w:p>
+        </w:tc>
+      </w:tr>
+      <w:tr>
+        <w:trPr>
+          <w:tblHeader w:val="false"/>
+        </w:trPr>
+        <w:tc>
+          <w:tcPr>
+            <w:tcW w:type="dxa" w:w="3600"/>
+            <w:tcMar>
+              <w:top w:type="dxa" w:w="80"/>
+              <w:left w:type="dxa" w:w="120"/>
+              <w:bottom w:type="dxa" w:w="80"/>
+              <w:right w:type="dxa" w:w="120"/>
+            </w:tcMar>
+          </w:tcPr>
+          <w:p>
+            <w:r>
+              <w:rPr>
+                <w:b w:val="false"/>
+                <w:bCs w:val="false"/>
+                <w:sz w:val="20"/>
+                <w:szCs w:val="20"/>
+              </w:rPr>
               <w:t xml:space="preserve">Nurse — Green Valley Health Centre</w:t>
             </w:r>
           </w:p>
@@ -2536,7 +2759,7 @@
                 <w:sz w:val="20"/>
                 <w:szCs w:val="20"/>
               </w:rPr>
-              <w:t xml:space="preserve">demo123</w:t>
+              <w:t xml:space="preserve">Demo@123</w:t>
             </w:r>
           </w:p>
         </w:tc>
@@ -3301,10 +3524,145 @@
           <w:b/>
           <w:bCs/>
         </w:rPr>
+        <w:t xml:space="preserve">Visit history: </w:t>
+      </w:r>
+      <w:r>
+        <w:t xml:space="preserve">on the case file every visit is one line (newest first, grouped by year). Click any date — or use the ↑ / ↓ keys — to see that entire visit: vitals, complaints, diagnosis, medicines, tests, advice and next visit. In the consult room, click any previous visit to open the same history browser; “Repeat Rx” copies that prescription.</w:t>
+      </w:r>
+    </w:p>
+    <w:p>
+      <w:pPr>
+        <w:pStyle w:val="ListParagraph"/>
+        <w:numPr>
+          <w:ilvl w:val="0"/>
+          <w:numId w:val="3"/>
+        </w:numPr>
+        <w:spacing w:after="80"/>
+      </w:pPr>
+      <w:r>
+        <w:rPr>
+          <w:b/>
+          <w:bCs/>
+        </w:rPr>
         <w:t xml:space="preserve">Shortcuts: </w:t>
       </w:r>
       <w:r>
         <w:t xml:space="preserve">N = new case, T = today, Ctrl + K = find patient.</w:t>
+      </w:r>
+    </w:p>
+    <w:p>
+      <w:pPr>
+        <w:pStyle w:val="Heading2"/>
+      </w:pPr>
+      <w:r>
+        <w:t xml:space="preserve">7.2 Platform admin console (for your team)</w:t>
+      </w:r>
+    </w:p>
+    <w:p>
+      <w:pPr>
+        <w:spacing w:after="120" w:line="300"/>
+      </w:pPr>
+      <w:r>
+        <w:t xml:space="preserve">Sign in as admin@carenest.app. The admin console is where you set up doctors — doctors no longer sign themselves up.</w:t>
+      </w:r>
+    </w:p>
+    <w:p>
+      <w:pPr>
+        <w:pStyle w:val="ListParagraph"/>
+        <w:numPr>
+          <w:ilvl w:val="0"/>
+          <w:numId w:val="7"/>
+        </w:numPr>
+        <w:spacing w:after="80"/>
+      </w:pPr>
+      <w:r>
+        <w:rPr>
+          <w:b/>
+          <w:bCs/>
+        </w:rPr>
+        <w:t xml:space="preserve">New doctor: </w:t>
+      </w:r>
+      <w:r>
+        <w:t xml:space="preserve">enter the profile (name, email, mobile, qualification, registration no., specialisation), address, how many clinics the doctor may own, and optionally create the clinics right away.</w:t>
+      </w:r>
+    </w:p>
+    <w:p>
+      <w:pPr>
+        <w:pStyle w:val="ListParagraph"/>
+        <w:numPr>
+          <w:ilvl w:val="0"/>
+          <w:numId w:val="7"/>
+        </w:numPr>
+        <w:spacing w:after="80"/>
+      </w:pPr>
+      <w:r>
+        <w:rPr>
+          <w:b/>
+          <w:bCs/>
+        </w:rPr>
+        <w:t xml:space="preserve">Password: </w:t>
+      </w:r>
+      <w:r>
+        <w:t xml:space="preserve">a strong temporary password is generated (you can type your own). Share it privately. At first sign-in the doctor must set their own password.</w:t>
+      </w:r>
+    </w:p>
+    <w:p>
+      <w:pPr>
+        <w:pStyle w:val="ListParagraph"/>
+        <w:numPr>
+          <w:ilvl w:val="0"/>
+          <w:numId w:val="7"/>
+        </w:numPr>
+        <w:spacing w:after="80"/>
+      </w:pPr>
+      <w:r>
+        <w:rPr>
+          <w:b/>
+          <w:bCs/>
+        </w:rPr>
+        <w:t xml:space="preserve">Doctors list: </w:t>
+      </w:r>
+      <w:r>
+        <w:t xml:space="preserve">search, open a doctor to edit details, raise the clinic limit, add a clinic, reset the password, unlock after failed attempts, or deactivate the account (signs them out everywhere).</w:t>
+      </w:r>
+    </w:p>
+    <w:p>
+      <w:pPr>
+        <w:pStyle w:val="ListParagraph"/>
+        <w:numPr>
+          <w:ilvl w:val="0"/>
+          <w:numId w:val="7"/>
+        </w:numPr>
+        <w:spacing w:after="80"/>
+      </w:pPr>
+      <w:r>
+        <w:rPr>
+          <w:b/>
+          <w:bCs/>
+        </w:rPr>
+        <w:t xml:space="preserve">Security log: </w:t>
+      </w:r>
+      <w:r>
+        <w:t xml:space="preserve">every sign-in, failed attempt, password change, case file opened and admin action, with time and IP address.</w:t>
+      </w:r>
+    </w:p>
+    <w:p>
+      <w:pPr>
+        <w:pBdr>
+          <w:left w:val="single" w:color="E0A800" w:sz="18" w:space="8"/>
+        </w:pBdr>
+        <w:shd w:fill="FFF8E1" w:color="auto" w:val="clear"/>
+        <w:spacing w:after="200" w:before="120"/>
+      </w:pPr>
+      <w:r>
+        <w:rPr>
+          <w:b/>
+          <w:bCs/>
+        </w:rPr>
+        <w:t xml:space="preserve">Replace the demo admin:  </w:t>
+      </w:r>
+      <w:r>
+        <w:t xml:space="preserve">before real use, create your own admin with “npm run admin:create -- --email you@yourcompany.com --name "Your Name" --password "AStrongPass2026"”, then start from an empty database (npm run db:setup).</w:t>
       </w:r>
     </w:p>
     <w:p>
@@ -3407,7 +3765,26 @@
         <w:spacing w:after="120" w:line="300"/>
       </w:pPr>
       <w:r>
-        <w:t xml:space="preserve">To start your own clinic instead of the demo: run “npm run db:setup” (empty tables), open the app and choose “Create your hospital account”.</w:t>
+        <w:t xml:space="preserve">To start for real instead of the demo: run “npm run db:setup” (empty tables), create your admin with “npm run admin:create”, sign in as admin and create the doctor accounts.</w:t>
+      </w:r>
+    </w:p>
+    <w:p>
+      <w:pPr>
+        <w:pBdr>
+          <w:left w:val="single" w:color="E0A800" w:sz="18" w:space="8"/>
+        </w:pBdr>
+        <w:shd w:fill="FFF8E1" w:color="auto" w:val="clear"/>
+        <w:spacing w:after="200" w:before="120"/>
+      </w:pPr>
+      <w:r>
+        <w:rPr>
+          <w:b/>
+          <w:bCs/>
+        </w:rPr>
+        <w:t xml:space="preserve">Security:  </w:t>
+      </w:r>
+      <w:r>
+        <w:t xml:space="preserve">for use over the internet, always run behind HTTPS (for example nginx with a free Let’s Encrypt certificate), set NODE_ENV=production and TRUST_PROXY=1 in server/.env, and read docs/SECURITY-AUDIT.md — it includes the go-live checklist.</w:t>
       </w:r>
     </w:p>
     <w:p>
@@ -4016,6 +4393,202 @@
           </w:p>
         </w:tc>
       </w:tr>
+      <w:tr>
+        <w:trPr>
+          <w:tblHeader w:val="false"/>
+        </w:trPr>
+        <w:tc>
+          <w:tcPr>
+            <w:tcW w:type="dxa" w:w="3600"/>
+            <w:tcMar>
+              <w:top w:type="dxa" w:w="80"/>
+              <w:left w:type="dxa" w:w="120"/>
+              <w:bottom w:type="dxa" w:w="80"/>
+              <w:right w:type="dxa" w:w="120"/>
+            </w:tcMar>
+          </w:tcPr>
+          <w:p>
+            <w:r>
+              <w:rPr>
+                <w:b w:val="false"/>
+                <w:bCs w:val="false"/>
+                <w:sz w:val="20"/>
+                <w:szCs w:val="20"/>
+              </w:rPr>
+              <w:t xml:space="preserve">“Account temporarily locked”</w:t>
+            </w:r>
+          </w:p>
+        </w:tc>
+        <w:tc>
+          <w:tcPr>
+            <w:tcW w:type="dxa" w:w="5426"/>
+            <w:tcMar>
+              <w:top w:type="dxa" w:w="80"/>
+              <w:left w:type="dxa" w:w="120"/>
+              <w:bottom w:type="dxa" w:w="80"/>
+              <w:right w:type="dxa" w:w="120"/>
+            </w:tcMar>
+          </w:tcPr>
+          <w:p>
+            <w:r>
+              <w:rPr>
+                <w:b w:val="false"/>
+                <w:bCs w:val="false"/>
+                <w:sz w:val="20"/>
+                <w:szCs w:val="20"/>
+              </w:rPr>
+              <w:t xml:space="preserve">Five wrong passwords lock an account for 15 minutes. Wait, or an admin can press Unlock on the doctor’s page.</w:t>
+            </w:r>
+          </w:p>
+        </w:tc>
+      </w:tr>
+      <w:tr>
+        <w:trPr>
+          <w:tblHeader w:val="false"/>
+        </w:trPr>
+        <w:tc>
+          <w:tcPr>
+            <w:tcW w:type="dxa" w:w="3600"/>
+            <w:tcMar>
+              <w:top w:type="dxa" w:w="80"/>
+              <w:left w:type="dxa" w:w="120"/>
+              <w:bottom w:type="dxa" w:w="80"/>
+              <w:right w:type="dxa" w:w="120"/>
+            </w:tcMar>
+          </w:tcPr>
+          <w:p>
+            <w:r>
+              <w:rPr>
+                <w:b w:val="false"/>
+                <w:bCs w:val="false"/>
+                <w:sz w:val="20"/>
+                <w:szCs w:val="20"/>
+              </w:rPr>
+              <w:t xml:space="preserve">Asked to “Set your own password”</w:t>
+            </w:r>
+          </w:p>
+        </w:tc>
+        <w:tc>
+          <w:tcPr>
+            <w:tcW w:type="dxa" w:w="5426"/>
+            <w:tcMar>
+              <w:top w:type="dxa" w:w="80"/>
+              <w:left w:type="dxa" w:w="120"/>
+              <w:bottom w:type="dxa" w:w="80"/>
+              <w:right w:type="dxa" w:w="120"/>
+            </w:tcMar>
+          </w:tcPr>
+          <w:p>
+            <w:r>
+              <w:rPr>
+                <w:b w:val="false"/>
+                <w:bCs w:val="false"/>
+                <w:sz w:val="20"/>
+                <w:szCs w:val="20"/>
+              </w:rPr>
+              <w:t xml:space="preserve">Normal at first sign-in with a password given by the admin or a doctor. Choose a new one with letters and numbers (8+ characters).</w:t>
+            </w:r>
+          </w:p>
+        </w:tc>
+      </w:tr>
+      <w:tr>
+        <w:trPr>
+          <w:tblHeader w:val="false"/>
+        </w:trPr>
+        <w:tc>
+          <w:tcPr>
+            <w:tcW w:type="dxa" w:w="3600"/>
+            <w:tcMar>
+              <w:top w:type="dxa" w:w="80"/>
+              <w:left w:type="dxa" w:w="120"/>
+              <w:bottom w:type="dxa" w:w="80"/>
+              <w:right w:type="dxa" w:w="120"/>
+            </w:tcMar>
+          </w:tcPr>
+          <w:p>
+            <w:r>
+              <w:rPr>
+                <w:b w:val="false"/>
+                <w:bCs w:val="false"/>
+                <w:sz w:val="20"/>
+                <w:szCs w:val="20"/>
+              </w:rPr>
+              <w:t xml:space="preserve">Signed out after restarting the server</w:t>
+            </w:r>
+          </w:p>
+        </w:tc>
+        <w:tc>
+          <w:tcPr>
+            <w:tcW w:type="dxa" w:w="5426"/>
+            <w:tcMar>
+              <w:top w:type="dxa" w:w="80"/>
+              <w:left w:type="dxa" w:w="120"/>
+              <w:bottom w:type="dxa" w:w="80"/>
+              <w:right w:type="dxa" w:w="120"/>
+            </w:tcMar>
+          </w:tcPr>
+          <w:p>
+            <w:r>
+              <w:rPr>
+                <w:b w:val="false"/>
+                <w:bCs w:val="false"/>
+                <w:sz w:val="20"/>
+                <w:szCs w:val="20"/>
+              </w:rPr>
+              <w:t xml:space="preserve">Run “npm run secret” once so the login secret is saved in server/.env.</w:t>
+            </w:r>
+          </w:p>
+        </w:tc>
+      </w:tr>
+      <w:tr>
+        <w:trPr>
+          <w:tblHeader w:val="false"/>
+        </w:trPr>
+        <w:tc>
+          <w:tcPr>
+            <w:tcW w:type="dxa" w:w="3600"/>
+            <w:tcMar>
+              <w:top w:type="dxa" w:w="80"/>
+              <w:left w:type="dxa" w:w="120"/>
+              <w:bottom w:type="dxa" w:w="80"/>
+              <w:right w:type="dxa" w:w="120"/>
+            </w:tcMar>
+          </w:tcPr>
+          <w:p>
+            <w:r>
+              <w:rPr>
+                <w:b w:val="false"/>
+                <w:bCs w:val="false"/>
+                <w:sz w:val="20"/>
+                <w:szCs w:val="20"/>
+              </w:rPr>
+              <w:t xml:space="preserve">Server says “JWT_SECRET must be set” and stops</w:t>
+            </w:r>
+          </w:p>
+        </w:tc>
+        <w:tc>
+          <w:tcPr>
+            <w:tcW w:type="dxa" w:w="5426"/>
+            <w:tcMar>
+              <w:top w:type="dxa" w:w="80"/>
+              <w:left w:type="dxa" w:w="120"/>
+              <w:bottom w:type="dxa" w:w="80"/>
+              <w:right w:type="dxa" w:w="120"/>
+            </w:tcMar>
+          </w:tcPr>
+          <w:p>
+            <w:r>
+              <w:rPr>
+                <w:b w:val="false"/>
+                <w:bCs w:val="false"/>
+                <w:sz w:val="20"/>
+                <w:szCs w:val="20"/>
+              </w:rPr>
+              <w:t xml:space="preserve">You are in production mode without a secret. Run “npm run secret”.</w:t>
+            </w:r>
+          </w:p>
+        </w:tc>
+      </w:tr>
     </w:tbl>
     <w:p>
       <w:pPr>
@@ -4338,6 +4911,156 @@
                 <w:szCs w:val="20"/>
               </w:rPr>
               <w:t xml:space="preserve">Recreate tables and load demo data (erases existing data).</w:t>
+            </w:r>
+          </w:p>
+        </w:tc>
+      </w:tr>
+      <w:tr>
+        <w:trPr>
+          <w:tblHeader w:val="false"/>
+        </w:trPr>
+        <w:tc>
+          <w:tcPr>
+            <w:tcW w:type="dxa" w:w="3000"/>
+            <w:tcMar>
+              <w:top w:type="dxa" w:w="80"/>
+              <w:left w:type="dxa" w:w="120"/>
+              <w:bottom w:type="dxa" w:w="80"/>
+              <w:right w:type="dxa" w:w="120"/>
+            </w:tcMar>
+          </w:tcPr>
+          <w:p>
+            <w:r>
+              <w:rPr>
+                <w:rFonts w:ascii="Consolas" w:cs="Consolas" w:eastAsia="Consolas" w:hAnsi="Consolas"/>
+                <w:b w:val="false"/>
+                <w:bCs w:val="false"/>
+                <w:sz w:val="20"/>
+                <w:szCs w:val="20"/>
+              </w:rPr>
+              <w:t xml:space="preserve">npm run secret</w:t>
+            </w:r>
+          </w:p>
+        </w:tc>
+        <w:tc>
+          <w:tcPr>
+            <w:tcW w:type="dxa" w:w="6026"/>
+            <w:tcMar>
+              <w:top w:type="dxa" w:w="80"/>
+              <w:left w:type="dxa" w:w="120"/>
+              <w:bottom w:type="dxa" w:w="80"/>
+              <w:right w:type="dxa" w:w="120"/>
+            </w:tcMar>
+          </w:tcPr>
+          <w:p>
+            <w:r>
+              <w:rPr>
+                <w:b w:val="false"/>
+                <w:bCs w:val="false"/>
+                <w:sz w:val="20"/>
+                <w:szCs w:val="20"/>
+              </w:rPr>
+              <w:t xml:space="preserve">Generate a strong login secret in server/.env.</w:t>
+            </w:r>
+          </w:p>
+        </w:tc>
+      </w:tr>
+      <w:tr>
+        <w:trPr>
+          <w:tblHeader w:val="false"/>
+        </w:trPr>
+        <w:tc>
+          <w:tcPr>
+            <w:tcW w:type="dxa" w:w="3000"/>
+            <w:tcMar>
+              <w:top w:type="dxa" w:w="80"/>
+              <w:left w:type="dxa" w:w="120"/>
+              <w:bottom w:type="dxa" w:w="80"/>
+              <w:right w:type="dxa" w:w="120"/>
+            </w:tcMar>
+          </w:tcPr>
+          <w:p>
+            <w:r>
+              <w:rPr>
+                <w:rFonts w:ascii="Consolas" w:cs="Consolas" w:eastAsia="Consolas" w:hAnsi="Consolas"/>
+                <w:b w:val="false"/>
+                <w:bCs w:val="false"/>
+                <w:sz w:val="20"/>
+                <w:szCs w:val="20"/>
+              </w:rPr>
+              <w:t xml:space="preserve">npm run admin:create -- --email … --password …</w:t>
+            </w:r>
+          </w:p>
+        </w:tc>
+        <w:tc>
+          <w:tcPr>
+            <w:tcW w:type="dxa" w:w="6026"/>
+            <w:tcMar>
+              <w:top w:type="dxa" w:w="80"/>
+              <w:left w:type="dxa" w:w="120"/>
+              <w:bottom w:type="dxa" w:w="80"/>
+              <w:right w:type="dxa" w:w="120"/>
+            </w:tcMar>
+          </w:tcPr>
+          <w:p>
+            <w:r>
+              <w:rPr>
+                <w:b w:val="false"/>
+                <w:bCs w:val="false"/>
+                <w:sz w:val="20"/>
+                <w:szCs w:val="20"/>
+              </w:rPr>
+              <w:t xml:space="preserve">Create or reset a platform admin account.</w:t>
+            </w:r>
+          </w:p>
+        </w:tc>
+      </w:tr>
+      <w:tr>
+        <w:trPr>
+          <w:tblHeader w:val="false"/>
+        </w:trPr>
+        <w:tc>
+          <w:tcPr>
+            <w:tcW w:type="dxa" w:w="3000"/>
+            <w:tcMar>
+              <w:top w:type="dxa" w:w="80"/>
+              <w:left w:type="dxa" w:w="120"/>
+              <w:bottom w:type="dxa" w:w="80"/>
+              <w:right w:type="dxa" w:w="120"/>
+            </w:tcMar>
+          </w:tcPr>
+          <w:p>
+            <w:r>
+              <w:rPr>
+                <w:rFonts w:ascii="Consolas" w:cs="Consolas" w:eastAsia="Consolas" w:hAnsi="Consolas"/>
+                <w:b w:val="false"/>
+                <w:bCs w:val="false"/>
+                <w:sz w:val="20"/>
+                <w:szCs w:val="20"/>
+              </w:rPr>
+              <w:t xml:space="preserve">npm run lint</w:t>
+            </w:r>
+          </w:p>
+        </w:tc>
+        <w:tc>
+          <w:tcPr>
+            <w:tcW w:type="dxa" w:w="6026"/>
+            <w:tcMar>
+              <w:top w:type="dxa" w:w="80"/>
+              <w:left w:type="dxa" w:w="120"/>
+              <w:bottom w:type="dxa" w:w="80"/>
+              <w:right w:type="dxa" w:w="120"/>
+            </w:tcMar>
+          </w:tcPr>
+          <w:p>
+            <w:r>
+              <w:rPr>
+                <w:b w:val="false"/>
+                <w:bCs w:val="false"/>
+                <w:sz w:val="20"/>
+                <w:szCs w:val="20"/>
+              </w:rPr>
+              <w:t xml:space="preserve">Check the code for problems (server + client).</w:t>
             </w:r>
           </w:p>
         </w:tc>
@@ -4702,6 +5425,12 @@
     </w:lvlOverride>
   </w:num>
   <w:num w:numId="6">
+    <w:abstractNumId w:val="3"/>
+    <w:lvlOverride w:ilvl="0">
+      <w:startOverride w:val="1"/>
+    </w:lvlOverride>
+  </w:num>
+  <w:num w:numId="7">
     <w:abstractNumId w:val="3"/>
     <w:lvlOverride w:ilvl="0">
       <w:startOverride w:val="1"/>

</xml_diff>

<commit_message>
Make the app phone-friendly and installable
- Bottom navigation with a New case action button and a More sheet that
  reaches every screen, appearance and sign-out (clinic app and admin)
- Consult room split into Patient & history / Consultation tabs on phones,
  sticky Complete bar; sticky Register bar on the New case form
- Visit history opens full-width on phones with next/previous navigation
- Security log shown as cards on phones; compact account totals
- 16px inputs to stop iOS zoom, larger touch targets, safe-area padding
- Fixed bottom bars stayed attached to the page during the entry animation
- Installable PWA: manifest, icons and a service worker that caches only
  the app shell (never /api data)
- README and setup guide updated
</commit_message>
<xml_diff>
--- a/docs/CareNest-HIMS-Local-Setup-Guide.docx
+++ b/docs/CareNest-HIMS-Local-Setup-Guide.docx
@@ -2980,10 +2980,10 @@
     </w:p>
     <w:p>
       <w:pPr>
-        <w:pStyle w:val="Heading1"/>
-      </w:pPr>
-      <w:r>
-        <w:t xml:space="preserve">7. A two-minute tour</w:t>
+        <w:pStyle w:val="Heading2"/>
+      </w:pPr>
+      <w:r>
+        <w:t xml:space="preserve">6.3 Use it like an app on phones and tablets</w:t>
       </w:r>
     </w:p>
     <w:p>
@@ -2991,7 +2991,62 @@
         <w:spacing w:after="120" w:line="300"/>
       </w:pPr>
       <w:r>
-        <w:t xml:space="preserve">Try the complete flow with two browser windows side by side — one signed in as the nurse, one as the doctor (use a private/incognito window for the second login).</w:t>
+        <w:t xml:space="preserve">The whole system is designed for phones too. At the bottom of the screen there is a menu: Today · Patients · ＋ New case (the big round button) · Consult · More. “More” opens every other screen (Insights, Accounts, Clinics, Settings), light/dark mode and Sign out.</w:t>
+      </w:r>
+    </w:p>
+    <w:p>
+      <w:pPr>
+        <w:pStyle w:val="ListParagraph"/>
+        <w:numPr>
+          <w:ilvl w:val="0"/>
+          <w:numId w:val="3"/>
+        </w:numPr>
+        <w:spacing w:after="80"/>
+      </w:pPr>
+      <w:r>
+        <w:rPr>
+          <w:b/>
+          <w:bCs/>
+        </w:rPr>
+        <w:t xml:space="preserve">Consult room on a phone: </w:t>
+      </w:r>
+      <w:r>
+        <w:t xml:space="preserve">switch between “Patient &amp; history” and “Consultation”. Tap “Start consultation”, fill in the notes, and tap “Complete” at the bottom.</w:t>
+      </w:r>
+    </w:p>
+    <w:p>
+      <w:pPr>
+        <w:pStyle w:val="ListParagraph"/>
+        <w:numPr>
+          <w:ilvl w:val="0"/>
+          <w:numId w:val="3"/>
+        </w:numPr>
+        <w:spacing w:after="80"/>
+      </w:pPr>
+      <w:r>
+        <w:rPr>
+          <w:b/>
+          <w:bCs/>
+        </w:rPr>
+        <w:t xml:space="preserve">Visit history on a phone: </w:t>
+      </w:r>
+      <w:r>
+        <w:t xml:space="preserve">tap any date to open that visit full-screen; use the arrows for the previous/next visit and “← All visits” to go back.</w:t>
+      </w:r>
+    </w:p>
+    <w:p>
+      <w:pPr>
+        <w:spacing w:after="120" w:line="300"/>
+      </w:pPr>
+      <w:r>
+        <w:rPr>
+          <w:b/>
+          <w:bCs/>
+        </w:rPr>
+        <w:t xml:space="preserve">Install as an app</w:t>
+      </w:r>
+      <w:r>
+        <w:t xml:space="preserve"> (works best with the production build, section 8):</w:t>
       </w:r>
     </w:p>
     <w:p>
@@ -3008,10 +3063,10 @@
           <w:b/>
           <w:bCs/>
         </w:rPr>
-        <w:t xml:space="preserve">Nurse → New case. </w:t>
-      </w:r>
-      <w:r>
-        <w:t xml:space="preserve">Enter name, gender and age, tap complaints and known conditions, type vitals (abnormal values turn red), then “Register &amp; add to queue” (or Ctrl + Enter). A unique 9-digit Case ID is generated.</w:t>
+        <w:t xml:space="preserve">Android (Chrome / Edge): </w:t>
+      </w:r>
+      <w:r>
+        <w:t xml:space="preserve">open the address, sign in, tap More → “Install the app”.</w:t>
       </w:r>
     </w:p>
     <w:p>
@@ -3028,10 +3083,34 @@
           <w:b/>
           <w:bCs/>
         </w:rPr>
-        <w:t xml:space="preserve">Nurse → Today. </w:t>
-      </w:r>
-      <w:r>
-        <w:t xml:space="preserve">The patient appears in the queue. When the patient walks in, tap “Display to doctor”.</w:t>
+        <w:t xml:space="preserve">iPhone / iPad (Safari): </w:t>
+      </w:r>
+      <w:r>
+        <w:t xml:space="preserve">open the address, tap the Share button, then “Add to Home Screen”.</w:t>
+      </w:r>
+    </w:p>
+    <w:p>
+      <w:pPr>
+        <w:spacing w:after="120" w:line="300"/>
+      </w:pPr>
+      <w:r>
+        <w:t xml:space="preserve">CareNest then opens full-screen from its own icon. Patient information is never saved on the phone — it always comes fresh from the clinic server.</w:t>
+      </w:r>
+    </w:p>
+    <w:p>
+      <w:pPr>
+        <w:pStyle w:val="Heading1"/>
+      </w:pPr>
+      <w:r>
+        <w:t xml:space="preserve">7. A two-minute tour</w:t>
+      </w:r>
+    </w:p>
+    <w:p>
+      <w:pPr>
+        <w:spacing w:after="120" w:line="300"/>
+      </w:pPr>
+      <w:r>
+        <w:t xml:space="preserve">Try the complete flow with two browser windows side by side — one signed in as the nurse, one as the doctor (use a private/incognito window for the second login).</w:t>
       </w:r>
     </w:p>
     <w:p>
@@ -3039,7 +3118,47 @@
         <w:pStyle w:val="ListParagraph"/>
         <w:numPr>
           <w:ilvl w:val="0"/>
-          <w:numId w:val="6"/>
+          <w:numId w:val="7"/>
+        </w:numPr>
+        <w:spacing w:after="80"/>
+      </w:pPr>
+      <w:r>
+        <w:rPr>
+          <w:b/>
+          <w:bCs/>
+        </w:rPr>
+        <w:t xml:space="preserve">Nurse → New case. </w:t>
+      </w:r>
+      <w:r>
+        <w:t xml:space="preserve">Enter name, gender and age, tap complaints and known conditions, type vitals (abnormal values turn red), then “Register &amp; add to queue” (or Ctrl + Enter). A unique 9-digit Case ID is generated.</w:t>
+      </w:r>
+    </w:p>
+    <w:p>
+      <w:pPr>
+        <w:pStyle w:val="ListParagraph"/>
+        <w:numPr>
+          <w:ilvl w:val="0"/>
+          <w:numId w:val="7"/>
+        </w:numPr>
+        <w:spacing w:after="80"/>
+      </w:pPr>
+      <w:r>
+        <w:rPr>
+          <w:b/>
+          <w:bCs/>
+        </w:rPr>
+        <w:t xml:space="preserve">Nurse → Today. </w:t>
+      </w:r>
+      <w:r>
+        <w:t xml:space="preserve">The patient appears in the queue. When the patient walks in, tap “Display to doctor”.</w:t>
+      </w:r>
+    </w:p>
+    <w:p>
+      <w:pPr>
+        <w:pStyle w:val="ListParagraph"/>
+        <w:numPr>
+          <w:ilvl w:val="0"/>
+          <w:numId w:val="7"/>
         </w:numPr>
         <w:spacing w:after="80"/>
       </w:pPr>
@@ -3059,7 +3178,7 @@
         <w:pStyle w:val="ListParagraph"/>
         <w:numPr>
           <w:ilvl w:val="0"/>
-          <w:numId w:val="6"/>
+          <w:numId w:val="7"/>
         </w:numPr>
         <w:spacing w:after="80"/>
       </w:pPr>
@@ -3079,7 +3198,7 @@
         <w:pStyle w:val="ListParagraph"/>
         <w:numPr>
           <w:ilvl w:val="0"/>
-          <w:numId w:val="6"/>
+          <w:numId w:val="7"/>
         </w:numPr>
         <w:spacing w:after="80"/>
       </w:pPr>
@@ -3099,7 +3218,7 @@
         <w:pStyle w:val="ListParagraph"/>
         <w:numPr>
           <w:ilvl w:val="0"/>
-          <w:numId w:val="6"/>
+          <w:numId w:val="7"/>
         </w:numPr>
         <w:spacing w:after="80"/>
       </w:pPr>
@@ -3571,7 +3690,7 @@
         <w:pStyle w:val="ListParagraph"/>
         <w:numPr>
           <w:ilvl w:val="0"/>
-          <w:numId w:val="7"/>
+          <w:numId w:val="8"/>
         </w:numPr>
         <w:spacing w:after="80"/>
       </w:pPr>
@@ -3591,7 +3710,7 @@
         <w:pStyle w:val="ListParagraph"/>
         <w:numPr>
           <w:ilvl w:val="0"/>
-          <w:numId w:val="7"/>
+          <w:numId w:val="8"/>
         </w:numPr>
         <w:spacing w:after="80"/>
       </w:pPr>
@@ -3611,7 +3730,7 @@
         <w:pStyle w:val="ListParagraph"/>
         <w:numPr>
           <w:ilvl w:val="0"/>
-          <w:numId w:val="7"/>
+          <w:numId w:val="8"/>
         </w:numPr>
         <w:spacing w:after="80"/>
       </w:pPr>
@@ -3631,7 +3750,7 @@
         <w:pStyle w:val="ListParagraph"/>
         <w:numPr>
           <w:ilvl w:val="0"/>
-          <w:numId w:val="7"/>
+          <w:numId w:val="8"/>
         </w:numPr>
         <w:spacing w:after="80"/>
       </w:pPr>
@@ -5431,6 +5550,12 @@
     </w:lvlOverride>
   </w:num>
   <w:num w:numId="7">
+    <w:abstractNumId w:val="3"/>
+    <w:lvlOverride w:ilvl="0">
+      <w:startOverride w:val="1"/>
+    </w:lvlOverride>
+  </w:num>
+  <w:num w:numId="8">
     <w:abstractNumId w:val="3"/>
     <w:lvlOverride w:ilvl="0">
       <w:startOverride w:val="1"/>

</xml_diff>

<commit_message>
Update README and setup guide for vendors and freelance practice
</commit_message>
<xml_diff>
--- a/docs/CareNest-HIMS-Local-Setup-Guide.docx
+++ b/docs/CareNest-HIMS-Local-Setup-Guide.docx
@@ -42,7 +42,7 @@
           <w:sz w:val="22"/>
           <w:szCs w:val="22"/>
         </w:rPr>
-        <w:t xml:space="preserve">Module 1 — Doctor ⇄ Nurse case flow · React + Node.js + MySQL</w:t>
+        <w:t xml:space="preserve">Case flow · Vendors &amp; purchases · Freelance practice · React + Node.js + MySQL</w:t>
       </w:r>
     </w:p>
     <w:p>
@@ -67,7 +67,7 @@
           <w:sz w:val="20"/>
           <w:szCs w:val="20"/>
         </w:rPr>
-        <w:t xml:space="preserve">Prepared 6 October 2026</w:t>
+        <w:t xml:space="preserve">Prepared 8 October 2026</w:t>
       </w:r>
     </w:p>
     <w:p>
@@ -302,7 +302,7 @@
                 <w:sz w:val="20"/>
                 <w:szCs w:val="20"/>
               </w:rPr>
-              <w:t xml:space="preserve">Stores clinics, staff, patients, visits, prescriptions, lab orders and accounts.</w:t>
+              <w:t xml:space="preserve">Stores clinics, staff, patients, visits, prescriptions, lab orders, accounts, vendors and purchases, and freelance work and payments.</w:t>
             </w:r>
           </w:p>
         </w:tc>
@@ -2786,6 +2786,79 @@
                 <w:sz w:val="20"/>
                 <w:szCs w:val="20"/>
               </w:rPr>
+              <w:t xml:space="preserve">Visiting / freelance doctor</w:t>
+            </w:r>
+          </w:p>
+        </w:tc>
+        <w:tc>
+          <w:tcPr>
+            <w:tcW w:type="dxa" w:w="3000"/>
+            <w:tcMar>
+              <w:top w:type="dxa" w:w="80"/>
+              <w:left w:type="dxa" w:w="120"/>
+              <w:bottom w:type="dxa" w:w="80"/>
+              <w:right w:type="dxa" w:w="120"/>
+            </w:tcMar>
+          </w:tcPr>
+          <w:p>
+            <w:r>
+              <w:rPr>
+                <w:rFonts w:ascii="Consolas" w:cs="Consolas" w:eastAsia="Consolas" w:hAnsi="Consolas"/>
+                <w:b w:val="false"/>
+                <w:bCs w:val="false"/>
+                <w:sz w:val="20"/>
+                <w:szCs w:val="20"/>
+              </w:rPr>
+              <w:t xml:space="preserve">freelance@demo.com</w:t>
+            </w:r>
+          </w:p>
+        </w:tc>
+        <w:tc>
+          <w:tcPr>
+            <w:tcW w:type="dxa" w:w="2426"/>
+            <w:tcMar>
+              <w:top w:type="dxa" w:w="80"/>
+              <w:left w:type="dxa" w:w="120"/>
+              <w:bottom w:type="dxa" w:w="80"/>
+              <w:right w:type="dxa" w:w="120"/>
+            </w:tcMar>
+          </w:tcPr>
+          <w:p>
+            <w:r>
+              <w:rPr>
+                <w:rFonts w:ascii="Consolas" w:cs="Consolas" w:eastAsia="Consolas" w:hAnsi="Consolas"/>
+                <w:b w:val="false"/>
+                <w:bCs w:val="false"/>
+                <w:sz w:val="20"/>
+                <w:szCs w:val="20"/>
+              </w:rPr>
+              <w:t xml:space="preserve">Demo@123</w:t>
+            </w:r>
+          </w:p>
+        </w:tc>
+      </w:tr>
+      <w:tr>
+        <w:trPr>
+          <w:tblHeader w:val="false"/>
+        </w:trPr>
+        <w:tc>
+          <w:tcPr>
+            <w:tcW w:type="dxa" w:w="3600"/>
+            <w:tcMar>
+              <w:top w:type="dxa" w:w="80"/>
+              <w:left w:type="dxa" w:w="120"/>
+              <w:bottom w:type="dxa" w:w="80"/>
+              <w:right w:type="dxa" w:w="120"/>
+            </w:tcMar>
+          </w:tcPr>
+          <w:p>
+            <w:r>
+              <w:rPr>
+                <w:b w:val="false"/>
+                <w:bCs w:val="false"/>
+                <w:sz w:val="20"/>
+                <w:szCs w:val="20"/>
+              </w:rPr>
               <w:t xml:space="preserve">Patient portal</w:t>
             </w:r>
           </w:p>
@@ -2869,6 +2942,25 @@
       </w:r>
       <w:r>
         <w:t xml:space="preserve">Today’s demo queue is created for the date on which you ran “npm run db:reset”. On a later day, run it again to get a fresh queue.</w:t>
+      </w:r>
+    </w:p>
+    <w:p>
+      <w:pPr>
+        <w:pBdr>
+          <w:left w:val="single" w:color="E0A800" w:sz="18" w:space="8"/>
+        </w:pBdr>
+        <w:shd w:fill="FFF8E1" w:color="auto" w:val="clear"/>
+        <w:spacing w:after="200" w:before="120"/>
+      </w:pPr>
+      <w:r>
+        <w:rPr>
+          <w:b/>
+          <w:bCs/>
+        </w:rPr>
+        <w:t xml:space="preserve">Updating from an earlier copy?  </w:t>
+      </w:r>
+      <w:r>
+        <w:t xml:space="preserve">After pulling the new code, run “npm run setup” and then “npm run db:reset” once. This creates the new vendor and freelance tables (it also reloads the demo data).</w:t>
       </w:r>
     </w:p>
     <w:p>
@@ -2991,7 +3083,15 @@
         <w:spacing w:after="120" w:line="300"/>
       </w:pPr>
       <w:r>
-        <w:t xml:space="preserve">The whole system is designed for phones too. At the bottom of the screen there is a menu: Today · Patients · ＋ New case (the big round button) · Consult · More. “More” opens every other screen (Insights, Accounts, Clinics, Settings), light/dark mode and Sign out.</w:t>
+        <w:t xml:space="preserve">The whole system is designed for phones too. At the bottom of the screen there is a menu: Today · Patients · ＋ New case (the big round button) · Consult · More. “More” opens every other screen (Insights, Accounts, Vendors, Clinics, Settings), light/dark mode and Sign out.</w:t>
+      </w:r>
+    </w:p>
+    <w:p>
+      <w:pPr>
+        <w:spacing w:after="120" w:line="300"/>
+      </w:pPr>
+      <w:r>
+        <w:t xml:space="preserve">A freelance (visiting) doctor gets their own menu instead: Work log · Workplaces · ＋ Log work · Earnings · More (My expenses, My vendors, Settings).</w:t>
       </w:r>
     </w:p>
     <w:p>
@@ -3546,7 +3646,7 @@
         <w:t xml:space="preserve">Accounts: </w:t>
       </w:r>
       <w:r>
-        <w:t xml:space="preserve">consultation fees are added automatically; record rent, salaries, supplies and other income in two taps.</w:t>
+        <w:t xml:space="preserve">consultation fees are added automatically; record rent, salaries, supplies and other income in two taps. Vendor payments appear here by themselves (marked “Vendor payment”).</w:t>
       </w:r>
     </w:p>
     <w:p>
@@ -3719,10 +3819,10 @@
           <w:b/>
           <w:bCs/>
         </w:rPr>
-        <w:t xml:space="preserve">Password: </w:t>
-      </w:r>
-      <w:r>
-        <w:t xml:space="preserve">a strong temporary password is generated (you can type your own). Share it privately. At first sign-in the doctor must set their own password.</w:t>
+        <w:t xml:space="preserve">Works as: </w:t>
+      </w:r>
+      <w:r>
+        <w:t xml:space="preserve">choose “Own clinic(s)”, “Freelance / visiting” or “Both”. A freelance doctor needs no clinic — they open straight to their Work log. “Both” shows the clinic screens and a “My practice” section. You can change this later on the doctor’s page.</w:t>
       </w:r>
     </w:p>
     <w:p>
@@ -3739,10 +3839,10 @@
           <w:b/>
           <w:bCs/>
         </w:rPr>
-        <w:t xml:space="preserve">Doctors list: </w:t>
-      </w:r>
-      <w:r>
-        <w:t xml:space="preserve">search, open a doctor to edit details, raise the clinic limit, add a clinic, reset the password, unlock after failed attempts, or deactivate the account (signs them out everywhere).</w:t>
+        <w:t xml:space="preserve">Password: </w:t>
+      </w:r>
+      <w:r>
+        <w:t xml:space="preserve">a strong temporary password is generated (you can type your own). Share it privately. At first sign-in the doctor must set their own password.</w:t>
       </w:r>
     </w:p>
     <w:p>
@@ -3759,6 +3859,26 @@
           <w:b/>
           <w:bCs/>
         </w:rPr>
+        <w:t xml:space="preserve">Doctors list: </w:t>
+      </w:r>
+      <w:r>
+        <w:t xml:space="preserve">search, open a doctor to edit details, raise the clinic limit, add a clinic, reset the password, unlock after failed attempts, or deactivate the account (signs them out everywhere).</w:t>
+      </w:r>
+    </w:p>
+    <w:p>
+      <w:pPr>
+        <w:pStyle w:val="ListParagraph"/>
+        <w:numPr>
+          <w:ilvl w:val="0"/>
+          <w:numId w:val="8"/>
+        </w:numPr>
+        <w:spacing w:after="80"/>
+      </w:pPr>
+      <w:r>
+        <w:rPr>
+          <w:b/>
+          <w:bCs/>
+        </w:rPr>
         <w:t xml:space="preserve">Security log: </w:t>
       </w:r>
       <w:r>
@@ -3782,6 +3902,514 @@
       </w:r>
       <w:r>
         <w:t xml:space="preserve">before real use, create your own admin with “npm run admin:create -- --email you@yourcompany.com --name "Your Name" --password "AStrongPass2026"”, then start from an empty database (npm run db:setup).</w:t>
+      </w:r>
+    </w:p>
+    <w:p>
+      <w:pPr>
+        <w:pStyle w:val="Heading2"/>
+      </w:pPr>
+      <w:r>
+        <w:t xml:space="preserve">7.3 Vendors &amp; purchases (clinic doctor)</w:t>
+      </w:r>
+    </w:p>
+    <w:p>
+      <w:pPr>
+        <w:spacing w:after="120" w:line="300"/>
+      </w:pPr>
+      <w:r>
+        <w:t xml:space="preserve">Keep track of everyone the clinic buys from — medicines, supplies, lab, equipment servicing, housekeeping — and what you still owe them. Vendors do not log in; this is only for your own records. Open “Vendors” in the menu (on a phone: More → Vendors).</w:t>
+      </w:r>
+    </w:p>
+    <w:p>
+      <w:pPr>
+        <w:pStyle w:val="ListParagraph"/>
+        <w:numPr>
+          <w:ilvl w:val="0"/>
+          <w:numId w:val="9"/>
+        </w:numPr>
+        <w:spacing w:after="80"/>
+      </w:pPr>
+      <w:r>
+        <w:rPr>
+          <w:b/>
+          <w:bCs/>
+        </w:rPr>
+        <w:t xml:space="preserve">Add vendor: </w:t>
+      </w:r>
+      <w:r>
+        <w:t xml:space="preserve">name, category, contact person, mobile, email, address, city, GSTIN, credit terms (for example 30 days, or pay on delivery) and notes.</w:t>
+      </w:r>
+    </w:p>
+    <w:p>
+      <w:pPr>
+        <w:pStyle w:val="ListParagraph"/>
+        <w:numPr>
+          <w:ilvl w:val="0"/>
+          <w:numId w:val="9"/>
+        </w:numPr>
+        <w:spacing w:after="80"/>
+      </w:pPr>
+      <w:r>
+        <w:rPr>
+          <w:b/>
+          <w:bCs/>
+        </w:rPr>
+        <w:t xml:space="preserve">New order: </w:t>
+      </w:r>
+      <w:r>
+        <w:t xml:space="preserve">the date and time are filled in; add items with quantity, unit, rate and GST %. Items you bought before fill in their last rate automatically.</w:t>
+      </w:r>
+    </w:p>
+    <w:p>
+      <w:pPr>
+        <w:pStyle w:val="ListParagraph"/>
+        <w:numPr>
+          <w:ilvl w:val="0"/>
+          <w:numId w:val="9"/>
+        </w:numPr>
+        <w:spacing w:after="80"/>
+      </w:pPr>
+      <w:r>
+        <w:rPr>
+          <w:b/>
+          <w:bCs/>
+        </w:rPr>
+        <w:t xml:space="preserve">Mark delivered: </w:t>
+      </w:r>
+      <w:r>
+        <w:t xml:space="preserve">record what actually arrived (all of it, or part of it), the invoice number, and batch/expiry if you like. The bill is calculated from the delivered quantity; you can change it to match the vendor’s invoice.</w:t>
+      </w:r>
+    </w:p>
+    <w:p>
+      <w:pPr>
+        <w:pStyle w:val="ListParagraph"/>
+        <w:numPr>
+          <w:ilvl w:val="0"/>
+          <w:numId w:val="9"/>
+        </w:numPr>
+        <w:spacing w:after="80"/>
+      </w:pPr>
+      <w:r>
+        <w:rPr>
+          <w:b/>
+          <w:bCs/>
+        </w:rPr>
+        <w:t xml:space="preserve">Record payment: </w:t>
+      </w:r>
+      <w:r>
+        <w:t xml:space="preserve">amount, date, mode (cash, UPI, card, bank transfer, cheque) and reference. Payments clear the oldest bills first. The payment is counted as a clinic expense on the day it is paid, so it appears in Accounts and Insights with no extra work.</w:t>
+      </w:r>
+    </w:p>
+    <w:p>
+      <w:pPr>
+        <w:pStyle w:val="ListParagraph"/>
+        <w:numPr>
+          <w:ilvl w:val="0"/>
+          <w:numId w:val="9"/>
+        </w:numPr>
+        <w:spacing w:after="80"/>
+      </w:pPr>
+      <w:r>
+        <w:rPr>
+          <w:b/>
+          <w:bCs/>
+        </w:rPr>
+        <w:t xml:space="preserve">Statement: </w:t>
+      </w:r>
+      <w:r>
+        <w:t xml:space="preserve">every bill and payment with a running balance. Download it as Excel/CSV or as a PDF to share with the vendor.</w:t>
+      </w:r>
+    </w:p>
+    <w:p>
+      <w:pPr>
+        <w:spacing w:after="120" w:line="300"/>
+      </w:pPr>
+      <w:r>
+        <w:t xml:space="preserve">The Vendors page shows what you owe, what is overdue (past the vendor’s credit terms), what falls due in the next 7 days and what is still awaiting delivery. The doctor’s Today page shows a small “vendor dues” card when something is due.</w:t>
+      </w:r>
+    </w:p>
+    <w:p>
+      <w:pPr>
+        <w:spacing w:before="120"/>
+        <w:jc w:val="center"/>
+      </w:pPr>
+      <w:r>
+        <w:drawing>
+          <wp:inline distT="0" distB="0" distL="0" distR="0">
+            <wp:extent cx="5715000" cy="3571875"/>
+            <wp:effectExtent t="0" r="0" b="0" l="0"/>
+            <wp:docPr id="1" name="" descr="" title=""/>
+            <wp:cNvGraphicFramePr>
+              <a:graphicFrameLocks xmlns:a="http://schemas.openxmlformats.org/drawingml/2006/main" noChangeAspect="1"/>
+            </wp:cNvGraphicFramePr>
+            <a:graphic xmlns:a="http://schemas.openxmlformats.org/drawingml/2006/main">
+              <a:graphicData uri="http://schemas.openxmlformats.org/drawingml/2006/picture">
+                <pic:pic xmlns:pic="http://schemas.openxmlformats.org/drawingml/2006/picture">
+                  <pic:nvPicPr>
+                    <pic:cNvPr id="0" name="" descr=""/>
+                    <pic:cNvPicPr>
+                      <a:picLocks noChangeAspect="1" noChangeArrowheads="1"/>
+                    </pic:cNvPicPr>
+                  </pic:nvPicPr>
+                  <pic:blipFill>
+                    <a:blip r:embed="rId12" cstate="none"/>
+                    <a:srcRect/>
+                    <a:stretch>
+                      <a:fillRect/>
+                    </a:stretch>
+                  </pic:blipFill>
+                  <pic:spPr bwMode="auto">
+                    <a:xfrm>
+                      <a:off x="0" y="0"/>
+                      <a:ext cx="5715000" cy="3571875"/>
+                    </a:xfrm>
+                    <a:prstGeom prst="rect">
+                      <a:avLst/>
+                    </a:prstGeom>
+                  </pic:spPr>
+                </pic:pic>
+              </a:graphicData>
+            </a:graphic>
+          </wp:inline>
+        </w:drawing>
+      </w:r>
+    </w:p>
+    <w:p>
+      <w:pPr>
+        <w:spacing w:after="240"/>
+        <w:jc w:val="center"/>
+      </w:pPr>
+      <w:r>
+        <w:rPr>
+          <w:i/>
+          <w:iCs/>
+          <w:color w:val="666666"/>
+          <w:sz w:val="18"/>
+          <w:szCs w:val="18"/>
+        </w:rPr>
+        <w:t xml:space="preserve">Vendors &amp; purchases — dues at a glance</w:t>
+      </w:r>
+    </w:p>
+    <w:p>
+      <w:pPr>
+        <w:spacing w:before="120"/>
+        <w:jc w:val="center"/>
+      </w:pPr>
+      <w:r>
+        <w:drawing>
+          <wp:inline distT="0" distB="0" distL="0" distR="0">
+            <wp:extent cx="5715000" cy="3571875"/>
+            <wp:effectExtent t="0" r="0" b="0" l="0"/>
+            <wp:docPr id="1" name="" descr="" title=""/>
+            <wp:cNvGraphicFramePr>
+              <a:graphicFrameLocks xmlns:a="http://schemas.openxmlformats.org/drawingml/2006/main" noChangeAspect="1"/>
+            </wp:cNvGraphicFramePr>
+            <a:graphic xmlns:a="http://schemas.openxmlformats.org/drawingml/2006/main">
+              <a:graphicData uri="http://schemas.openxmlformats.org/drawingml/2006/picture">
+                <pic:pic xmlns:pic="http://schemas.openxmlformats.org/drawingml/2006/picture">
+                  <pic:nvPicPr>
+                    <pic:cNvPr id="0" name="" descr=""/>
+                    <pic:cNvPicPr>
+                      <a:picLocks noChangeAspect="1" noChangeArrowheads="1"/>
+                    </pic:cNvPicPr>
+                  </pic:nvPicPr>
+                  <pic:blipFill>
+                    <a:blip r:embed="rId13" cstate="none"/>
+                    <a:srcRect/>
+                    <a:stretch>
+                      <a:fillRect/>
+                    </a:stretch>
+                  </pic:blipFill>
+                  <pic:spPr bwMode="auto">
+                    <a:xfrm>
+                      <a:off x="0" y="0"/>
+                      <a:ext cx="5715000" cy="3571875"/>
+                    </a:xfrm>
+                    <a:prstGeom prst="rect">
+                      <a:avLst/>
+                    </a:prstGeom>
+                  </pic:spPr>
+                </pic:pic>
+              </a:graphicData>
+            </a:graphic>
+          </wp:inline>
+        </w:drawing>
+      </w:r>
+    </w:p>
+    <w:p>
+      <w:pPr>
+        <w:spacing w:after="240"/>
+        <w:jc w:val="center"/>
+      </w:pPr>
+      <w:r>
+        <w:rPr>
+          <w:i/>
+          <w:iCs/>
+          <w:color w:val="666666"/>
+          <w:sz w:val="18"/>
+          <w:szCs w:val="18"/>
+        </w:rPr>
+        <w:t xml:space="preserve">One vendor — orders, deliveries, payments and statement</w:t>
+      </w:r>
+    </w:p>
+    <w:p>
+      <w:pPr>
+        <w:pStyle w:val="Heading2"/>
+      </w:pPr>
+      <w:r>
+        <w:t xml:space="preserve">7.4 Freelance practice (visiting doctor)</w:t>
+      </w:r>
+    </w:p>
+    <w:p>
+      <w:pPr>
+        <w:spacing w:after="120" w:line="300"/>
+      </w:pPr>
+      <w:r>
+        <w:t xml:space="preserve">For doctors who work at several hospitals, nursing homes or platforms. Sign in as freelance@demo.com to see a doctor who visits four places. The admin decides who sees this (“Works as”, section 7.2).</w:t>
+      </w:r>
+    </w:p>
+    <w:p>
+      <w:pPr>
+        <w:pStyle w:val="ListParagraph"/>
+        <w:numPr>
+          <w:ilvl w:val="0"/>
+          <w:numId w:val="10"/>
+        </w:numPr>
+        <w:spacing w:after="80"/>
+      </w:pPr>
+      <w:r>
+        <w:rPr>
+          <w:b/>
+          <w:bCs/>
+        </w:rPr>
+        <w:t xml:space="preserve">Workplaces: </w:t>
+      </w:r>
+      <w:r>
+        <w:t xml:space="preserve">add each hospital or clinic with its city, address, contact person and phone, how it pays you (per case, per procedure, fixed per visit, monthly retainer or a revenue share %), your usual fee, the TDS % it deducts, and how many days it usually takes to pay.</w:t>
+      </w:r>
+    </w:p>
+    <w:p>
+      <w:pPr>
+        <w:pStyle w:val="ListParagraph"/>
+        <w:numPr>
+          <w:ilvl w:val="0"/>
+          <w:numId w:val="10"/>
+        </w:numPr>
+        <w:spacing w:after="80"/>
+      </w:pPr>
+      <w:r>
+        <w:rPr>
+          <w:b/>
+          <w:bCs/>
+        </w:rPr>
+        <w:t xml:space="preserve">Log work (＋ button or N): </w:t>
+      </w:r>
+      <w:r>
+        <w:t xml:space="preserve">pick the workplace, date and time, type of work (consultation, procedure, surgery, on-call…), type the procedure name (earlier names are suggested), short patient details (name, age, gender, mobile, IP/UHID) and the amount mentioned. Tick “Paid on the spot” if you were paid immediately. “Save &amp; add another” keeps the workplace and date for the next entry.</w:t>
+      </w:r>
+    </w:p>
+    <w:p>
+      <w:pPr>
+        <w:pStyle w:val="ListParagraph"/>
+        <w:numPr>
+          <w:ilvl w:val="0"/>
+          <w:numId w:val="10"/>
+        </w:numPr>
+        <w:spacing w:after="80"/>
+      </w:pPr>
+      <w:r>
+        <w:rPr>
+          <w:b/>
+          <w:bCs/>
+        </w:rPr>
+        <w:t xml:space="preserve">Payment received: </w:t>
+      </w:r>
+      <w:r>
+        <w:t xml:space="preserve">on a workplace, enter what was paid. Type the gross amount and the TDS is worked out for you, or enter what reached your bank. Payments settle the oldest pending work first. If a case will never be paid, open it in the Work log and “Write off” (it can be undone).</w:t>
+      </w:r>
+    </w:p>
+    <w:p>
+      <w:pPr>
+        <w:pStyle w:val="ListParagraph"/>
+        <w:numPr>
+          <w:ilvl w:val="0"/>
+          <w:numId w:val="10"/>
+        </w:numPr>
+        <w:spacing w:after="80"/>
+      </w:pPr>
+      <w:r>
+        <w:rPr>
+          <w:b/>
+          <w:bCs/>
+        </w:rPr>
+        <w:t xml:space="preserve">Earnings &amp; balance sheet: </w:t>
+      </w:r>
+      <w:r>
+        <w:t xml:space="preserve">for 1 month to all time — billed, received, TDS deducted (your tax credit), expenses, net in hand, pending and overdue. It is broken down by workplace, procedure and city, shows how old the pending amounts are, and lists who to follow up with. Export to Excel/CSV.</w:t>
+      </w:r>
+    </w:p>
+    <w:p>
+      <w:pPr>
+        <w:pStyle w:val="ListParagraph"/>
+        <w:numPr>
+          <w:ilvl w:val="0"/>
+          <w:numId w:val="10"/>
+        </w:numPr>
+        <w:spacing w:after="80"/>
+      </w:pPr>
+      <w:r>
+        <w:rPr>
+          <w:b/>
+          <w:bCs/>
+        </w:rPr>
+        <w:t xml:space="preserve">Statements: </w:t>
+      </w:r>
+      <w:r>
+        <w:t xml:space="preserve">each workplace has a statement with a running balance — download it as Excel/CSV or PDF and send it to the hospital’s accounts team.</w:t>
+      </w:r>
+    </w:p>
+    <w:p>
+      <w:pPr>
+        <w:pStyle w:val="ListParagraph"/>
+        <w:numPr>
+          <w:ilvl w:val="0"/>
+          <w:numId w:val="10"/>
+        </w:numPr>
+        <w:spacing w:after="80"/>
+      </w:pPr>
+      <w:r>
+        <w:rPr>
+          <w:b/>
+          <w:bCs/>
+        </w:rPr>
+        <w:t xml:space="preserve">My expenses and My vendors: </w:t>
+      </w:r>
+      <w:r>
+        <w:t xml:space="preserve">travel, CME, indemnity insurance, instruments and so on, plus personal suppliers with the same order/payment tracking as clinic vendors. These count in “Expenses” and “Net in hand”.</w:t>
+      </w:r>
+    </w:p>
+    <w:p>
+      <w:pPr>
+        <w:spacing w:before="120"/>
+        <w:jc w:val="center"/>
+      </w:pPr>
+      <w:r>
+        <w:drawing>
+          <wp:inline distT="0" distB="0" distL="0" distR="0">
+            <wp:extent cx="5715000" cy="3571875"/>
+            <wp:effectExtent t="0" r="0" b="0" l="0"/>
+            <wp:docPr id="1" name="" descr="" title=""/>
+            <wp:cNvGraphicFramePr>
+              <a:graphicFrameLocks xmlns:a="http://schemas.openxmlformats.org/drawingml/2006/main" noChangeAspect="1"/>
+            </wp:cNvGraphicFramePr>
+            <a:graphic xmlns:a="http://schemas.openxmlformats.org/drawingml/2006/main">
+              <a:graphicData uri="http://schemas.openxmlformats.org/drawingml/2006/picture">
+                <pic:pic xmlns:pic="http://schemas.openxmlformats.org/drawingml/2006/picture">
+                  <pic:nvPicPr>
+                    <pic:cNvPr id="0" name="" descr=""/>
+                    <pic:cNvPicPr>
+                      <a:picLocks noChangeAspect="1" noChangeArrowheads="1"/>
+                    </pic:cNvPicPr>
+                  </pic:nvPicPr>
+                  <pic:blipFill>
+                    <a:blip r:embed="rId14" cstate="none"/>
+                    <a:srcRect/>
+                    <a:stretch>
+                      <a:fillRect/>
+                    </a:stretch>
+                  </pic:blipFill>
+                  <pic:spPr bwMode="auto">
+                    <a:xfrm>
+                      <a:off x="0" y="0"/>
+                      <a:ext cx="5715000" cy="3571875"/>
+                    </a:xfrm>
+                    <a:prstGeom prst="rect">
+                      <a:avLst/>
+                    </a:prstGeom>
+                  </pic:spPr>
+                </pic:pic>
+              </a:graphicData>
+            </a:graphic>
+          </wp:inline>
+        </w:drawing>
+      </w:r>
+    </w:p>
+    <w:p>
+      <w:pPr>
+        <w:spacing w:after="240"/>
+        <w:jc w:val="center"/>
+      </w:pPr>
+      <w:r>
+        <w:rPr>
+          <w:i/>
+          <w:iCs/>
+          <w:color w:val="666666"/>
+          <w:sz w:val="18"/>
+          <w:szCs w:val="18"/>
+        </w:rPr>
+        <w:t xml:space="preserve">Work log — every case with what was agreed and what is pending</w:t>
+      </w:r>
+    </w:p>
+    <w:p>
+      <w:pPr>
+        <w:spacing w:before="120"/>
+        <w:jc w:val="center"/>
+      </w:pPr>
+      <w:r>
+        <w:drawing>
+          <wp:inline distT="0" distB="0" distL="0" distR="0">
+            <wp:extent cx="5715000" cy="3571875"/>
+            <wp:effectExtent t="0" r="0" b="0" l="0"/>
+            <wp:docPr id="1" name="" descr="" title=""/>
+            <wp:cNvGraphicFramePr>
+              <a:graphicFrameLocks xmlns:a="http://schemas.openxmlformats.org/drawingml/2006/main" noChangeAspect="1"/>
+            </wp:cNvGraphicFramePr>
+            <a:graphic xmlns:a="http://schemas.openxmlformats.org/drawingml/2006/main">
+              <a:graphicData uri="http://schemas.openxmlformats.org/drawingml/2006/picture">
+                <pic:pic xmlns:pic="http://schemas.openxmlformats.org/drawingml/2006/picture">
+                  <pic:nvPicPr>
+                    <pic:cNvPr id="0" name="" descr=""/>
+                    <pic:cNvPicPr>
+                      <a:picLocks noChangeAspect="1" noChangeArrowheads="1"/>
+                    </pic:cNvPicPr>
+                  </pic:nvPicPr>
+                  <pic:blipFill>
+                    <a:blip r:embed="rId15" cstate="none"/>
+                    <a:srcRect/>
+                    <a:stretch>
+                      <a:fillRect/>
+                    </a:stretch>
+                  </pic:blipFill>
+                  <pic:spPr bwMode="auto">
+                    <a:xfrm>
+                      <a:off x="0" y="0"/>
+                      <a:ext cx="5715000" cy="3571875"/>
+                    </a:xfrm>
+                    <a:prstGeom prst="rect">
+                      <a:avLst/>
+                    </a:prstGeom>
+                  </pic:spPr>
+                </pic:pic>
+              </a:graphicData>
+            </a:graphic>
+          </wp:inline>
+        </w:drawing>
+      </w:r>
+    </w:p>
+    <w:p>
+      <w:pPr>
+        <w:spacing w:after="240"/>
+        <w:jc w:val="center"/>
+      </w:pPr>
+      <w:r>
+        <w:rPr>
+          <w:i/>
+          <w:iCs/>
+          <w:color w:val="666666"/>
+          <w:sz w:val="18"/>
+          <w:szCs w:val="18"/>
+        </w:rPr>
+        <w:t xml:space="preserve">Earnings &amp; balance sheet</w:t>
       </w:r>
     </w:p>
     <w:p>
@@ -4508,6 +5136,104 @@
                 <w:szCs w:val="20"/>
               </w:rPr>
               <w:t xml:space="preserve">Use “npm run dev:lan”, keep both devices on the same Wi-Fi and allow Node.js in the firewall.</w:t>
+            </w:r>
+          </w:p>
+        </w:tc>
+      </w:tr>
+      <w:tr>
+        <w:trPr>
+          <w:tblHeader w:val="false"/>
+        </w:trPr>
+        <w:tc>
+          <w:tcPr>
+            <w:tcW w:type="dxa" w:w="3600"/>
+            <w:tcMar>
+              <w:top w:type="dxa" w:w="80"/>
+              <w:left w:type="dxa" w:w="120"/>
+              <w:bottom w:type="dxa" w:w="80"/>
+              <w:right w:type="dxa" w:w="120"/>
+            </w:tcMar>
+          </w:tcPr>
+          <w:p>
+            <w:r>
+              <w:rPr>
+                <w:b w:val="false"/>
+                <w:bCs w:val="false"/>
+                <w:sz w:val="20"/>
+                <w:szCs w:val="20"/>
+              </w:rPr>
+              <w:t xml:space="preserve">“Table … vendors doesn’t exist” or the Vendors / Work log page shows an error</w:t>
+            </w:r>
+          </w:p>
+        </w:tc>
+        <w:tc>
+          <w:tcPr>
+            <w:tcW w:type="dxa" w:w="5426"/>
+            <w:tcMar>
+              <w:top w:type="dxa" w:w="80"/>
+              <w:left w:type="dxa" w:w="120"/>
+              <w:bottom w:type="dxa" w:w="80"/>
+              <w:right w:type="dxa" w:w="120"/>
+            </w:tcMar>
+          </w:tcPr>
+          <w:p>
+            <w:r>
+              <w:rPr>
+                <w:b w:val="false"/>
+                <w:bCs w:val="false"/>
+                <w:sz w:val="20"/>
+                <w:szCs w:val="20"/>
+              </w:rPr>
+              <w:t xml:space="preserve">The database was created with an older copy. Run “npm run db:reset” once (or “npm run db:setup” for empty tables).</w:t>
+            </w:r>
+          </w:p>
+        </w:tc>
+      </w:tr>
+      <w:tr>
+        <w:trPr>
+          <w:tblHeader w:val="false"/>
+        </w:trPr>
+        <w:tc>
+          <w:tcPr>
+            <w:tcW w:type="dxa" w:w="3600"/>
+            <w:tcMar>
+              <w:top w:type="dxa" w:w="80"/>
+              <w:left w:type="dxa" w:w="120"/>
+              <w:bottom w:type="dxa" w:w="80"/>
+              <w:right w:type="dxa" w:w="120"/>
+            </w:tcMar>
+          </w:tcPr>
+          <w:p>
+            <w:r>
+              <w:rPr>
+                <w:b w:val="false"/>
+                <w:bCs w:val="false"/>
+                <w:sz w:val="20"/>
+                <w:szCs w:val="20"/>
+              </w:rPr>
+              <w:t xml:space="preserve">“Too many sign-in attempts”</w:t>
+            </w:r>
+          </w:p>
+        </w:tc>
+        <w:tc>
+          <w:tcPr>
+            <w:tcW w:type="dxa" w:w="5426"/>
+            <w:tcMar>
+              <w:top w:type="dxa" w:w="80"/>
+              <w:left w:type="dxa" w:w="120"/>
+              <w:bottom w:type="dxa" w:w="80"/>
+              <w:right w:type="dxa" w:w="120"/>
+            </w:tcMar>
+          </w:tcPr>
+          <w:p>
+            <w:r>
+              <w:rPr>
+                <w:b w:val="false"/>
+                <w:bCs w:val="false"/>
+                <w:sz w:val="20"/>
+                <w:szCs w:val="20"/>
+              </w:rPr>
+              <w:t xml:space="preserve">Several sign-ins in a short time from one computer are slowed down for safety. Wait 15 minutes, or stop and start “npm run dev” again on your own laptop.</w:t>
             </w:r>
           </w:p>
         </w:tc>
@@ -5556,6 +6282,18 @@
     </w:lvlOverride>
   </w:num>
   <w:num w:numId="8">
+    <w:abstractNumId w:val="3"/>
+    <w:lvlOverride w:ilvl="0">
+      <w:startOverride w:val="1"/>
+    </w:lvlOverride>
+  </w:num>
+  <w:num w:numId="9">
+    <w:abstractNumId w:val="3"/>
+    <w:lvlOverride w:ilvl="0">
+      <w:startOverride w:val="1"/>
+    </w:lvlOverride>
+  </w:num>
+  <w:num w:numId="10">
     <w:abstractNumId w:val="3"/>
     <w:lvlOverride w:ilvl="0">
       <w:startOverride w:val="1"/>

</xml_diff>

<commit_message>
Update setup guide: demo accounts, passwords and updating
</commit_message>
<xml_diff>
--- a/docs/CareNest-HIMS-Local-Setup-Guide.docx
+++ b/docs/CareNest-HIMS-Local-Setup-Guide.docx
@@ -2922,7 +2922,83 @@
         <w:spacing w:after="120" w:line="300"/>
       </w:pPr>
       <w:r>
-        <w:t xml:space="preserve">The login page also has one-click “Try the demo” buttons. The patient portal is reached from “I’m a patient — open my case sheet”.</w:t>
+        <w:t xml:space="preserve">The login page lists every demo account under “Demo accounts” — tap one to sign in. The last row (Patient) opens the patient portal with the demo Case ID filled in.</w:t>
+      </w:r>
+    </w:p>
+    <w:p>
+      <w:pPr>
+        <w:pStyle w:val="Heading2"/>
+      </w:pPr>
+      <w:r>
+        <w:t xml:space="preserve">6.2 What happens when you change a password</w:t>
+      </w:r>
+    </w:p>
+    <w:p>
+      <w:pPr>
+        <w:spacing w:after="120" w:line="300"/>
+      </w:pPr>
+      <w:r>
+        <w:t xml:space="preserve">Passwords are stored in the MySQL database, not in the code. When you change a password (Settings → Change password, or the admin resets one), it stays changed after you close the terminal, restart the laptop, or run “npm run dev” again.</w:t>
+      </w:r>
+    </w:p>
+    <w:p>
+      <w:pPr>
+        <w:pStyle w:val="ListParagraph"/>
+        <w:numPr>
+          <w:ilvl w:val="0"/>
+          <w:numId w:val="3"/>
+        </w:numPr>
+        <w:spacing w:after="80"/>
+      </w:pPr>
+      <w:r>
+        <w:rPr>
+          <w:b/>
+          <w:bCs/>
+        </w:rPr>
+        <w:t xml:space="preserve">Signing in: </w:t>
+      </w:r>
+      <w:r>
+        <w:t xml:space="preserve">type the new password in the form. If you tap a demo account whose password you changed, the app tells you so and puts the email in the form for you.</w:t>
+      </w:r>
+    </w:p>
+    <w:p>
+      <w:pPr>
+        <w:pStyle w:val="ListParagraph"/>
+        <w:numPr>
+          <w:ilvl w:val="0"/>
+          <w:numId w:val="3"/>
+        </w:numPr>
+        <w:spacing w:after="80"/>
+      </w:pPr>
+      <w:r>
+        <w:rPr>
+          <w:b/>
+          <w:bCs/>
+        </w:rPr>
+        <w:t xml:space="preserve">Getting the demo passwords back: </w:t>
+      </w:r>
+      <w:r>
+        <w:t xml:space="preserve">run “npm run db:reset”. This recreates the database with the demo data and the demo passwords — it also erases everything you entered, so back up first (section 9) if you have real data.</w:t>
+      </w:r>
+    </w:p>
+    <w:p>
+      <w:pPr>
+        <w:pStyle w:val="ListParagraph"/>
+        <w:numPr>
+          <w:ilvl w:val="0"/>
+          <w:numId w:val="3"/>
+        </w:numPr>
+        <w:spacing w:after="80"/>
+      </w:pPr>
+      <w:r>
+        <w:rPr>
+          <w:b/>
+          <w:bCs/>
+        </w:rPr>
+        <w:t xml:space="preserve">Forgot the admin password? </w:t>
+      </w:r>
+      <w:r>
+        <w:t xml:space="preserve">run “npm run admin:create -- --email admin@carenest.app --name "Admin" --password "NewStrongPass2026"” — it resets that admin’s password without touching other data.</w:t>
       </w:r>
     </w:p>
     <w:p>
@@ -2957,10 +3033,10 @@
           <w:b/>
           <w:bCs/>
         </w:rPr>
-        <w:t xml:space="preserve">Updating from an earlier copy?  </w:t>
-      </w:r>
-      <w:r>
-        <w:t xml:space="preserve">After pulling the new code, run “npm run setup” and then “npm run db:reset” once. This creates the new vendor and freelance tables (it also reloads the demo data).</w:t>
+        <w:t xml:space="preserve">Updating to a newer copy of the code?  </w:t>
+      </w:r>
+      <w:r>
+        <w:t xml:space="preserve">Stop the app (Ctrl + C), get the new code (git pull, or replace the folder), run “npm run setup”, then “npm run dev”. Your data and passwords stay as they are. Run “npm run db:reset” only when the update adds new tables (for example the vendor and freelance update) — it reloads the demo data and erases your entries.</w:t>
       </w:r>
     </w:p>
     <w:p>
@@ -2968,7 +3044,7 @@
         <w:pStyle w:val="Heading2"/>
       </w:pPr>
       <w:r>
-        <w:t xml:space="preserve">6.2 Open it on the doctor’s phone (same Wi-Fi)</w:t>
+        <w:t xml:space="preserve">6.3 Open it on the doctor’s phone (same Wi-Fi)</w:t>
       </w:r>
     </w:p>
     <w:p>
@@ -3075,7 +3151,7 @@
         <w:pStyle w:val="Heading2"/>
       </w:pPr>
       <w:r>
-        <w:t xml:space="preserve">6.3 Use it like an app on phones and tablets</w:t>
+        <w:t xml:space="preserve">6.4 Use it like an app on phones and tablets</w:t>
       </w:r>
     </w:p>
     <w:p>
@@ -3723,6 +3799,26 @@
           <w:b/>
           <w:bCs/>
         </w:rPr>
+        <w:t xml:space="preserve">Row menu (⋯): </w:t>
+      </w:r>
+      <w:r>
+        <w:t xml:space="preserve">next to each waiting patient — Update vitals, Open case file, Cancel visit. It always opens on top, and opens upwards near the bottom of the screen.</w:t>
+      </w:r>
+    </w:p>
+    <w:p>
+      <w:pPr>
+        <w:pStyle w:val="ListParagraph"/>
+        <w:numPr>
+          <w:ilvl w:val="0"/>
+          <w:numId w:val="3"/>
+        </w:numPr>
+        <w:spacing w:after="80"/>
+      </w:pPr>
+      <w:r>
+        <w:rPr>
+          <w:b/>
+          <w:bCs/>
+        </w:rPr>
         <w:t xml:space="preserve">Dark mode: </w:t>
       </w:r>
       <w:r>
@@ -5234,6 +5330,55 @@
                 <w:szCs w:val="20"/>
               </w:rPr>
               <w:t xml:space="preserve">Several sign-ins in a short time from one computer are slowed down for safety. Wait 15 minutes, or stop and start “npm run dev” again on your own laptop.</w:t>
+            </w:r>
+          </w:p>
+        </w:tc>
+      </w:tr>
+      <w:tr>
+        <w:trPr>
+          <w:tblHeader w:val="false"/>
+        </w:trPr>
+        <w:tc>
+          <w:tcPr>
+            <w:tcW w:type="dxa" w:w="3600"/>
+            <w:tcMar>
+              <w:top w:type="dxa" w:w="80"/>
+              <w:left w:type="dxa" w:w="120"/>
+              <w:bottom w:type="dxa" w:w="80"/>
+              <w:right w:type="dxa" w:w="120"/>
+            </w:tcMar>
+          </w:tcPr>
+          <w:p>
+            <w:r>
+              <w:rPr>
+                <w:b w:val="false"/>
+                <w:bCs w:val="false"/>
+                <w:sz w:val="20"/>
+                <w:szCs w:val="20"/>
+              </w:rPr>
+              <w:t xml:space="preserve">“This demo password has been changed”</w:t>
+            </w:r>
+          </w:p>
+        </w:tc>
+        <w:tc>
+          <w:tcPr>
+            <w:tcW w:type="dxa" w:w="5426"/>
+            <w:tcMar>
+              <w:top w:type="dxa" w:w="80"/>
+              <w:left w:type="dxa" w:w="120"/>
+              <w:bottom w:type="dxa" w:w="80"/>
+              <w:right w:type="dxa" w:w="120"/>
+            </w:tcMar>
+          </w:tcPr>
+          <w:p>
+            <w:r>
+              <w:rPr>
+                <w:b w:val="false"/>
+                <w:bCs w:val="false"/>
+                <w:sz w:val="20"/>
+                <w:szCs w:val="20"/>
+              </w:rPr>
+              <w:t xml:space="preserve">You changed that account’s password earlier. Type the new password, or run “npm run db:reset” to restore all demo passwords (erases data).</w:t>
             </w:r>
           </w:p>
         </w:tc>

</xml_diff>